<commit_message>
AI vision: tách điểm danh học sinh thành F8a (xác nhận có mặt) và F8b (giám sát liên tục) theo QĐ 33 mục I.3
Co-Authored-By: Claude Opus 5.5 <noreply@anthropic.com>
Claude-Session: https://claude.ai/code/session_01Cob8EJkgsHZYQRqhfdnueU
</commit_message>
<xml_diff>
--- a/templates/09-ai-vision/b2-phan-loai-rui-ro-he-thong-ai.docx
+++ b/templates/09-ai-vision/b2-phan-loai-rui-ro-he-thong-ai.docx
@@ -5157,14 +5157,14 @@
       </w:tblPr>
       <w:tblGrid>
         <w:gridCol w:w="497"/>
-        <w:gridCol w:w="1428"/>
-        <w:gridCol w:w="1587"/>
-        <w:gridCol w:w="1305"/>
-        <w:gridCol w:w="1634"/>
-        <w:gridCol w:w="1634"/>
-        <w:gridCol w:w="1767"/>
-        <w:gridCol w:w="2040"/>
-        <w:gridCol w:w="2065"/>
+        <w:gridCol w:w="1677"/>
+        <w:gridCol w:w="1535"/>
+        <w:gridCol w:w="1342"/>
+        <w:gridCol w:w="1578"/>
+        <w:gridCol w:w="1578"/>
+        <w:gridCol w:w="1711"/>
+        <w:gridCol w:w="2029"/>
+        <w:gridCol w:w="2010"/>
       </w:tblGrid>
       <w:tr>
         <w:trPr>
@@ -5211,7 +5211,7 @@
         </w:tc>
         <w:tc>
           <w:tcPr>
-            <w:tcW w:type="dxa" w:w="1428"/>
+            <w:tcW w:type="dxa" w:w="1677"/>
             <w:tcBorders>
               <w:top w:val="single" w:color="000000" w:sz="4"/>
               <w:left w:val="single" w:color="000000" w:sz="4"/>
@@ -5249,7 +5249,7 @@
         </w:tc>
         <w:tc>
           <w:tcPr>
-            <w:tcW w:type="dxa" w:w="1587"/>
+            <w:tcW w:type="dxa" w:w="1535"/>
             <w:tcBorders>
               <w:top w:val="single" w:color="000000" w:sz="4"/>
               <w:left w:val="single" w:color="000000" w:sz="4"/>
@@ -5287,7 +5287,7 @@
         </w:tc>
         <w:tc>
           <w:tcPr>
-            <w:tcW w:type="dxa" w:w="1305"/>
+            <w:tcW w:type="dxa" w:w="1342"/>
             <w:tcBorders>
               <w:top w:val="single" w:color="000000" w:sz="4"/>
               <w:left w:val="single" w:color="000000" w:sz="4"/>
@@ -5325,7 +5325,7 @@
         </w:tc>
         <w:tc>
           <w:tcPr>
-            <w:tcW w:type="dxa" w:w="1634"/>
+            <w:tcW w:type="dxa" w:w="1578"/>
             <w:tcBorders>
               <w:top w:val="single" w:color="000000" w:sz="4"/>
               <w:left w:val="single" w:color="000000" w:sz="4"/>
@@ -5363,7 +5363,7 @@
         </w:tc>
         <w:tc>
           <w:tcPr>
-            <w:tcW w:type="dxa" w:w="1634"/>
+            <w:tcW w:type="dxa" w:w="1578"/>
             <w:tcBorders>
               <w:top w:val="single" w:color="000000" w:sz="4"/>
               <w:left w:val="single" w:color="000000" w:sz="4"/>
@@ -5401,7 +5401,7 @@
         </w:tc>
         <w:tc>
           <w:tcPr>
-            <w:tcW w:type="dxa" w:w="1767"/>
+            <w:tcW w:type="dxa" w:w="1711"/>
             <w:tcBorders>
               <w:top w:val="single" w:color="000000" w:sz="4"/>
               <w:left w:val="single" w:color="000000" w:sz="4"/>
@@ -5439,7 +5439,7 @@
         </w:tc>
         <w:tc>
           <w:tcPr>
-            <w:tcW w:type="dxa" w:w="2040"/>
+            <w:tcW w:type="dxa" w:w="2029"/>
             <w:tcBorders>
               <w:top w:val="single" w:color="000000" w:sz="4"/>
               <w:left w:val="single" w:color="000000" w:sz="4"/>
@@ -5477,7 +5477,7 @@
         </w:tc>
         <w:tc>
           <w:tcPr>
-            <w:tcW w:type="dxa" w:w="2065"/>
+            <w:tcW w:type="dxa" w:w="2010"/>
             <w:tcBorders>
               <w:top w:val="single" w:color="000000" w:sz="4"/>
               <w:left w:val="single" w:color="000000" w:sz="4"/>
@@ -5558,7 +5558,7 @@
         </w:tc>
         <w:tc>
           <w:tcPr>
-            <w:tcW w:type="dxa" w:w="1428"/>
+            <w:tcW w:type="dxa" w:w="1677"/>
             <w:tcBorders>
               <w:top w:val="single" w:color="000000" w:sz="4"/>
               <w:left w:val="single" w:color="000000" w:sz="4"/>
@@ -5595,7 +5595,7 @@
         </w:tc>
         <w:tc>
           <w:tcPr>
-            <w:tcW w:type="dxa" w:w="1587"/>
+            <w:tcW w:type="dxa" w:w="1535"/>
             <w:tcBorders>
               <w:top w:val="single" w:color="000000" w:sz="4"/>
               <w:left w:val="single" w:color="000000" w:sz="4"/>
@@ -5632,7 +5632,7 @@
         </w:tc>
         <w:tc>
           <w:tcPr>
-            <w:tcW w:type="dxa" w:w="1305"/>
+            <w:tcW w:type="dxa" w:w="1342"/>
             <w:tcBorders>
               <w:top w:val="single" w:color="000000" w:sz="4"/>
               <w:left w:val="single" w:color="000000" w:sz="4"/>
@@ -5669,7 +5669,7 @@
         </w:tc>
         <w:tc>
           <w:tcPr>
-            <w:tcW w:type="dxa" w:w="1634"/>
+            <w:tcW w:type="dxa" w:w="1578"/>
             <w:tcBorders>
               <w:top w:val="single" w:color="000000" w:sz="4"/>
               <w:left w:val="single" w:color="000000" w:sz="4"/>
@@ -5706,7 +5706,7 @@
         </w:tc>
         <w:tc>
           <w:tcPr>
-            <w:tcW w:type="dxa" w:w="1634"/>
+            <w:tcW w:type="dxa" w:w="1578"/>
             <w:tcBorders>
               <w:top w:val="single" w:color="000000" w:sz="4"/>
               <w:left w:val="single" w:color="000000" w:sz="4"/>
@@ -5743,7 +5743,7 @@
         </w:tc>
         <w:tc>
           <w:tcPr>
-            <w:tcW w:type="dxa" w:w="1767"/>
+            <w:tcW w:type="dxa" w:w="1711"/>
             <w:tcBorders>
               <w:top w:val="single" w:color="000000" w:sz="4"/>
               <w:left w:val="single" w:color="000000" w:sz="4"/>
@@ -5780,7 +5780,7 @@
         </w:tc>
         <w:tc>
           <w:tcPr>
-            <w:tcW w:type="dxa" w:w="2040"/>
+            <w:tcW w:type="dxa" w:w="2029"/>
             <w:tcBorders>
               <w:top w:val="single" w:color="000000" w:sz="4"/>
               <w:left w:val="single" w:color="000000" w:sz="4"/>
@@ -5817,7 +5817,7 @@
         </w:tc>
         <w:tc>
           <w:tcPr>
-            <w:tcW w:type="dxa" w:w="2065"/>
+            <w:tcW w:type="dxa" w:w="2010"/>
             <w:tcBorders>
               <w:top w:val="single" w:color="000000" w:sz="4"/>
               <w:left w:val="single" w:color="000000" w:sz="4"/>
@@ -5897,7 +5897,7 @@
         </w:tc>
         <w:tc>
           <w:tcPr>
-            <w:tcW w:type="dxa" w:w="1428"/>
+            <w:tcW w:type="dxa" w:w="1677"/>
             <w:tcBorders>
               <w:top w:val="single" w:color="000000" w:sz="4"/>
               <w:left w:val="single" w:color="000000" w:sz="4"/>
@@ -5934,7 +5934,7 @@
         </w:tc>
         <w:tc>
           <w:tcPr>
-            <w:tcW w:type="dxa" w:w="1587"/>
+            <w:tcW w:type="dxa" w:w="1535"/>
             <w:tcBorders>
               <w:top w:val="single" w:color="000000" w:sz="4"/>
               <w:left w:val="single" w:color="000000" w:sz="4"/>
@@ -5971,7 +5971,7 @@
         </w:tc>
         <w:tc>
           <w:tcPr>
-            <w:tcW w:type="dxa" w:w="1305"/>
+            <w:tcW w:type="dxa" w:w="1342"/>
             <w:tcBorders>
               <w:top w:val="single" w:color="000000" w:sz="4"/>
               <w:left w:val="single" w:color="000000" w:sz="4"/>
@@ -6008,7 +6008,7 @@
         </w:tc>
         <w:tc>
           <w:tcPr>
-            <w:tcW w:type="dxa" w:w="1634"/>
+            <w:tcW w:type="dxa" w:w="1578"/>
             <w:tcBorders>
               <w:top w:val="single" w:color="000000" w:sz="4"/>
               <w:left w:val="single" w:color="000000" w:sz="4"/>
@@ -6045,7 +6045,7 @@
         </w:tc>
         <w:tc>
           <w:tcPr>
-            <w:tcW w:type="dxa" w:w="1634"/>
+            <w:tcW w:type="dxa" w:w="1578"/>
             <w:tcBorders>
               <w:top w:val="single" w:color="000000" w:sz="4"/>
               <w:left w:val="single" w:color="000000" w:sz="4"/>
@@ -6082,7 +6082,7 @@
         </w:tc>
         <w:tc>
           <w:tcPr>
-            <w:tcW w:type="dxa" w:w="1767"/>
+            <w:tcW w:type="dxa" w:w="1711"/>
             <w:tcBorders>
               <w:top w:val="single" w:color="000000" w:sz="4"/>
               <w:left w:val="single" w:color="000000" w:sz="4"/>
@@ -6143,7 +6143,7 @@
         </w:tc>
         <w:tc>
           <w:tcPr>
-            <w:tcW w:type="dxa" w:w="2040"/>
+            <w:tcW w:type="dxa" w:w="2029"/>
             <w:tcBorders>
               <w:top w:val="single" w:color="000000" w:sz="4"/>
               <w:left w:val="single" w:color="000000" w:sz="4"/>
@@ -6180,7 +6180,7 @@
         </w:tc>
         <w:tc>
           <w:tcPr>
-            <w:tcW w:type="dxa" w:w="2065"/>
+            <w:tcW w:type="dxa" w:w="2010"/>
             <w:tcBorders>
               <w:top w:val="single" w:color="000000" w:sz="4"/>
               <w:left w:val="single" w:color="000000" w:sz="4"/>
@@ -6272,7 +6272,7 @@
         </w:tc>
         <w:tc>
           <w:tcPr>
-            <w:tcW w:type="dxa" w:w="1428"/>
+            <w:tcW w:type="dxa" w:w="1677"/>
             <w:tcBorders>
               <w:top w:val="single" w:color="000000" w:sz="4"/>
               <w:left w:val="single" w:color="000000" w:sz="4"/>
@@ -6309,7 +6309,7 @@
         </w:tc>
         <w:tc>
           <w:tcPr>
-            <w:tcW w:type="dxa" w:w="1587"/>
+            <w:tcW w:type="dxa" w:w="1535"/>
             <w:tcBorders>
               <w:top w:val="single" w:color="000000" w:sz="4"/>
               <w:left w:val="single" w:color="000000" w:sz="4"/>
@@ -6346,7 +6346,7 @@
         </w:tc>
         <w:tc>
           <w:tcPr>
-            <w:tcW w:type="dxa" w:w="1305"/>
+            <w:tcW w:type="dxa" w:w="1342"/>
             <w:tcBorders>
               <w:top w:val="single" w:color="000000" w:sz="4"/>
               <w:left w:val="single" w:color="000000" w:sz="4"/>
@@ -6383,7 +6383,7 @@
         </w:tc>
         <w:tc>
           <w:tcPr>
-            <w:tcW w:type="dxa" w:w="1634"/>
+            <w:tcW w:type="dxa" w:w="1578"/>
             <w:tcBorders>
               <w:top w:val="single" w:color="000000" w:sz="4"/>
               <w:left w:val="single" w:color="000000" w:sz="4"/>
@@ -6420,7 +6420,7 @@
         </w:tc>
         <w:tc>
           <w:tcPr>
-            <w:tcW w:type="dxa" w:w="1634"/>
+            <w:tcW w:type="dxa" w:w="1578"/>
             <w:tcBorders>
               <w:top w:val="single" w:color="000000" w:sz="4"/>
               <w:left w:val="single" w:color="000000" w:sz="4"/>
@@ -6457,7 +6457,7 @@
         </w:tc>
         <w:tc>
           <w:tcPr>
-            <w:tcW w:type="dxa" w:w="1767"/>
+            <w:tcW w:type="dxa" w:w="1711"/>
             <w:tcBorders>
               <w:top w:val="single" w:color="000000" w:sz="4"/>
               <w:left w:val="single" w:color="000000" w:sz="4"/>
@@ -6494,7 +6494,7 @@
         </w:tc>
         <w:tc>
           <w:tcPr>
-            <w:tcW w:type="dxa" w:w="2040"/>
+            <w:tcW w:type="dxa" w:w="2029"/>
             <w:tcBorders>
               <w:top w:val="single" w:color="000000" w:sz="4"/>
               <w:left w:val="single" w:color="000000" w:sz="4"/>
@@ -6543,7 +6543,7 @@
         </w:tc>
         <w:tc>
           <w:tcPr>
-            <w:tcW w:type="dxa" w:w="2065"/>
+            <w:tcW w:type="dxa" w:w="2010"/>
             <w:tcBorders>
               <w:top w:val="single" w:color="000000" w:sz="4"/>
               <w:left w:val="single" w:color="000000" w:sz="4"/>
@@ -6635,7 +6635,7 @@
         </w:tc>
         <w:tc>
           <w:tcPr>
-            <w:tcW w:type="dxa" w:w="1428"/>
+            <w:tcW w:type="dxa" w:w="1677"/>
             <w:tcBorders>
               <w:top w:val="single" w:color="000000" w:sz="4"/>
               <w:left w:val="single" w:color="000000" w:sz="4"/>
@@ -6672,7 +6672,7 @@
         </w:tc>
         <w:tc>
           <w:tcPr>
-            <w:tcW w:type="dxa" w:w="1587"/>
+            <w:tcW w:type="dxa" w:w="1535"/>
             <w:tcBorders>
               <w:top w:val="single" w:color="000000" w:sz="4"/>
               <w:left w:val="single" w:color="000000" w:sz="4"/>
@@ -6709,7 +6709,7 @@
         </w:tc>
         <w:tc>
           <w:tcPr>
-            <w:tcW w:type="dxa" w:w="1305"/>
+            <w:tcW w:type="dxa" w:w="1342"/>
             <w:tcBorders>
               <w:top w:val="single" w:color="000000" w:sz="4"/>
               <w:left w:val="single" w:color="000000" w:sz="4"/>
@@ -6746,7 +6746,7 @@
         </w:tc>
         <w:tc>
           <w:tcPr>
-            <w:tcW w:type="dxa" w:w="1634"/>
+            <w:tcW w:type="dxa" w:w="1578"/>
             <w:tcBorders>
               <w:top w:val="single" w:color="000000" w:sz="4"/>
               <w:left w:val="single" w:color="000000" w:sz="4"/>
@@ -6783,7 +6783,7 @@
         </w:tc>
         <w:tc>
           <w:tcPr>
-            <w:tcW w:type="dxa" w:w="1634"/>
+            <w:tcW w:type="dxa" w:w="1578"/>
             <w:tcBorders>
               <w:top w:val="single" w:color="000000" w:sz="4"/>
               <w:left w:val="single" w:color="000000" w:sz="4"/>
@@ -6820,7 +6820,7 @@
         </w:tc>
         <w:tc>
           <w:tcPr>
-            <w:tcW w:type="dxa" w:w="1767"/>
+            <w:tcW w:type="dxa" w:w="1711"/>
             <w:tcBorders>
               <w:top w:val="single" w:color="000000" w:sz="4"/>
               <w:left w:val="single" w:color="000000" w:sz="4"/>
@@ -6857,7 +6857,7 @@
         </w:tc>
         <w:tc>
           <w:tcPr>
-            <w:tcW w:type="dxa" w:w="2040"/>
+            <w:tcW w:type="dxa" w:w="2029"/>
             <w:tcBorders>
               <w:top w:val="single" w:color="000000" w:sz="4"/>
               <w:left w:val="single" w:color="000000" w:sz="4"/>
@@ -6894,7 +6894,7 @@
         </w:tc>
         <w:tc>
           <w:tcPr>
-            <w:tcW w:type="dxa" w:w="2065"/>
+            <w:tcW w:type="dxa" w:w="2010"/>
             <w:tcBorders>
               <w:top w:val="single" w:color="000000" w:sz="4"/>
               <w:left w:val="single" w:color="000000" w:sz="4"/>
@@ -6974,7 +6974,7 @@
         </w:tc>
         <w:tc>
           <w:tcPr>
-            <w:tcW w:type="dxa" w:w="1428"/>
+            <w:tcW w:type="dxa" w:w="1677"/>
             <w:tcBorders>
               <w:top w:val="single" w:color="000000" w:sz="4"/>
               <w:left w:val="single" w:color="000000" w:sz="4"/>
@@ -7011,7 +7011,7 @@
         </w:tc>
         <w:tc>
           <w:tcPr>
-            <w:tcW w:type="dxa" w:w="1587"/>
+            <w:tcW w:type="dxa" w:w="1535"/>
             <w:tcBorders>
               <w:top w:val="single" w:color="000000" w:sz="4"/>
               <w:left w:val="single" w:color="000000" w:sz="4"/>
@@ -7048,7 +7048,7 @@
         </w:tc>
         <w:tc>
           <w:tcPr>
-            <w:tcW w:type="dxa" w:w="1305"/>
+            <w:tcW w:type="dxa" w:w="1342"/>
             <w:tcBorders>
               <w:top w:val="single" w:color="000000" w:sz="4"/>
               <w:left w:val="single" w:color="000000" w:sz="4"/>
@@ -7085,7 +7085,7 @@
         </w:tc>
         <w:tc>
           <w:tcPr>
-            <w:tcW w:type="dxa" w:w="1634"/>
+            <w:tcW w:type="dxa" w:w="1578"/>
             <w:tcBorders>
               <w:top w:val="single" w:color="000000" w:sz="4"/>
               <w:left w:val="single" w:color="000000" w:sz="4"/>
@@ -7158,7 +7158,7 @@
         </w:tc>
         <w:tc>
           <w:tcPr>
-            <w:tcW w:type="dxa" w:w="1634"/>
+            <w:tcW w:type="dxa" w:w="1578"/>
             <w:tcBorders>
               <w:top w:val="single" w:color="000000" w:sz="4"/>
               <w:left w:val="single" w:color="000000" w:sz="4"/>
@@ -7195,7 +7195,7 @@
         </w:tc>
         <w:tc>
           <w:tcPr>
-            <w:tcW w:type="dxa" w:w="1767"/>
+            <w:tcW w:type="dxa" w:w="1711"/>
             <w:tcBorders>
               <w:top w:val="single" w:color="000000" w:sz="4"/>
               <w:left w:val="single" w:color="000000" w:sz="4"/>
@@ -7244,7 +7244,7 @@
         </w:tc>
         <w:tc>
           <w:tcPr>
-            <w:tcW w:type="dxa" w:w="2040"/>
+            <w:tcW w:type="dxa" w:w="2029"/>
             <w:tcBorders>
               <w:top w:val="single" w:color="000000" w:sz="4"/>
               <w:left w:val="single" w:color="000000" w:sz="4"/>
@@ -7293,7 +7293,7 @@
         </w:tc>
         <w:tc>
           <w:tcPr>
-            <w:tcW w:type="dxa" w:w="2065"/>
+            <w:tcW w:type="dxa" w:w="2010"/>
             <w:tcBorders>
               <w:top w:val="single" w:color="000000" w:sz="4"/>
               <w:left w:val="single" w:color="000000" w:sz="4"/>
@@ -7409,7 +7409,7 @@
         </w:tc>
         <w:tc>
           <w:tcPr>
-            <w:tcW w:type="dxa" w:w="1428"/>
+            <w:tcW w:type="dxa" w:w="1677"/>
             <w:tcBorders>
               <w:top w:val="single" w:color="000000" w:sz="4"/>
               <w:left w:val="single" w:color="000000" w:sz="4"/>
@@ -7446,7 +7446,7 @@
         </w:tc>
         <w:tc>
           <w:tcPr>
-            <w:tcW w:type="dxa" w:w="1587"/>
+            <w:tcW w:type="dxa" w:w="1535"/>
             <w:tcBorders>
               <w:top w:val="single" w:color="000000" w:sz="4"/>
               <w:left w:val="single" w:color="000000" w:sz="4"/>
@@ -7483,7 +7483,7 @@
         </w:tc>
         <w:tc>
           <w:tcPr>
-            <w:tcW w:type="dxa" w:w="1305"/>
+            <w:tcW w:type="dxa" w:w="1342"/>
             <w:tcBorders>
               <w:top w:val="single" w:color="000000" w:sz="4"/>
               <w:left w:val="single" w:color="000000" w:sz="4"/>
@@ -7520,7 +7520,7 @@
         </w:tc>
         <w:tc>
           <w:tcPr>
-            <w:tcW w:type="dxa" w:w="1634"/>
+            <w:tcW w:type="dxa" w:w="1578"/>
             <w:tcBorders>
               <w:top w:val="single" w:color="000000" w:sz="4"/>
               <w:left w:val="single" w:color="000000" w:sz="4"/>
@@ -7617,7 +7617,7 @@
         </w:tc>
         <w:tc>
           <w:tcPr>
-            <w:tcW w:type="dxa" w:w="1634"/>
+            <w:tcW w:type="dxa" w:w="1578"/>
             <w:tcBorders>
               <w:top w:val="single" w:color="000000" w:sz="4"/>
               <w:left w:val="single" w:color="000000" w:sz="4"/>
@@ -7654,7 +7654,7 @@
         </w:tc>
         <w:tc>
           <w:tcPr>
-            <w:tcW w:type="dxa" w:w="1767"/>
+            <w:tcW w:type="dxa" w:w="1711"/>
             <w:tcBorders>
               <w:top w:val="single" w:color="000000" w:sz="4"/>
               <w:left w:val="single" w:color="000000" w:sz="4"/>
@@ -7691,7 +7691,7 @@
         </w:tc>
         <w:tc>
           <w:tcPr>
-            <w:tcW w:type="dxa" w:w="2040"/>
+            <w:tcW w:type="dxa" w:w="2029"/>
             <w:tcBorders>
               <w:top w:val="single" w:color="000000" w:sz="4"/>
               <w:left w:val="single" w:color="000000" w:sz="4"/>
@@ -7728,7 +7728,7 @@
         </w:tc>
         <w:tc>
           <w:tcPr>
-            <w:tcW w:type="dxa" w:w="2065"/>
+            <w:tcW w:type="dxa" w:w="2010"/>
             <w:tcBorders>
               <w:top w:val="single" w:color="000000" w:sz="4"/>
               <w:left w:val="single" w:color="000000" w:sz="4"/>
@@ -7808,7 +7808,7 @@
         </w:tc>
         <w:tc>
           <w:tcPr>
-            <w:tcW w:type="dxa" w:w="1428"/>
+            <w:tcW w:type="dxa" w:w="1677"/>
             <w:tcBorders>
               <w:top w:val="single" w:color="000000" w:sz="4"/>
               <w:left w:val="single" w:color="000000" w:sz="4"/>
@@ -7845,7 +7845,7 @@
         </w:tc>
         <w:tc>
           <w:tcPr>
-            <w:tcW w:type="dxa" w:w="1587"/>
+            <w:tcW w:type="dxa" w:w="1535"/>
             <w:tcBorders>
               <w:top w:val="single" w:color="000000" w:sz="4"/>
               <w:left w:val="single" w:color="000000" w:sz="4"/>
@@ -7882,7 +7882,7 @@
         </w:tc>
         <w:tc>
           <w:tcPr>
-            <w:tcW w:type="dxa" w:w="1305"/>
+            <w:tcW w:type="dxa" w:w="1342"/>
             <w:tcBorders>
               <w:top w:val="single" w:color="000000" w:sz="4"/>
               <w:left w:val="single" w:color="000000" w:sz="4"/>
@@ -7919,7 +7919,7 @@
         </w:tc>
         <w:tc>
           <w:tcPr>
-            <w:tcW w:type="dxa" w:w="1634"/>
+            <w:tcW w:type="dxa" w:w="1578"/>
             <w:tcBorders>
               <w:top w:val="single" w:color="000000" w:sz="4"/>
               <w:left w:val="single" w:color="000000" w:sz="4"/>
@@ -7992,7 +7992,7 @@
         </w:tc>
         <w:tc>
           <w:tcPr>
-            <w:tcW w:type="dxa" w:w="1634"/>
+            <w:tcW w:type="dxa" w:w="1578"/>
             <w:tcBorders>
               <w:top w:val="single" w:color="000000" w:sz="4"/>
               <w:left w:val="single" w:color="000000" w:sz="4"/>
@@ -8029,7 +8029,7 @@
         </w:tc>
         <w:tc>
           <w:tcPr>
-            <w:tcW w:type="dxa" w:w="1767"/>
+            <w:tcW w:type="dxa" w:w="1711"/>
             <w:tcBorders>
               <w:top w:val="single" w:color="000000" w:sz="4"/>
               <w:left w:val="single" w:color="000000" w:sz="4"/>
@@ -8066,7 +8066,7 @@
         </w:tc>
         <w:tc>
           <w:tcPr>
-            <w:tcW w:type="dxa" w:w="2040"/>
+            <w:tcW w:type="dxa" w:w="2029"/>
             <w:tcBorders>
               <w:top w:val="single" w:color="000000" w:sz="4"/>
               <w:left w:val="single" w:color="000000" w:sz="4"/>
@@ -8139,7 +8139,7 @@
         </w:tc>
         <w:tc>
           <w:tcPr>
-            <w:tcW w:type="dxa" w:w="2065"/>
+            <w:tcW w:type="dxa" w:w="2010"/>
             <w:tcBorders>
               <w:top w:val="single" w:color="000000" w:sz="4"/>
               <w:left w:val="single" w:color="000000" w:sz="4"/>
@@ -8213,13 +8213,13 @@
                 <w:sz w:val="18"/>
                 <w:szCs w:val="18"/>
               </w:rPr>
-              <w:t xml:space="preserve">F8</w:t>
-            </w:r>
-          </w:p>
-        </w:tc>
-        <w:tc>
-          <w:tcPr>
-            <w:tcW w:type="dxa" w:w="1428"/>
+              <w:t xml:space="preserve">F8a</w:t>
+            </w:r>
+          </w:p>
+        </w:tc>
+        <w:tc>
+          <w:tcPr>
+            <w:tcW w:type="dxa" w:w="1677"/>
             <w:tcBorders>
               <w:top w:val="single" w:color="000000" w:sz="4"/>
               <w:left w:val="single" w:color="000000" w:sz="4"/>
@@ -8250,70 +8250,20 @@
                 <w:sz w:val="18"/>
                 <w:szCs w:val="18"/>
               </w:rPr>
-              <w:t xml:space="preserve">Điểm danh học sinh bằng khuôn mặt</w:t>
-            </w:r>
-          </w:p>
-        </w:tc>
-        <w:tc>
-          <w:tcPr>
-            <w:tcW w:type="dxa" w:w="1587"/>
-            <w:tcBorders>
-              <w:top w:val="single" w:color="000000" w:sz="4"/>
-              <w:left w:val="single" w:color="000000" w:sz="4"/>
-              <w:bottom w:val="single" w:color="000000" w:sz="4"/>
-              <w:right w:val="single" w:color="000000" w:sz="4"/>
-            </w:tcBorders>
-            <w:tcMar>
-              <w:top w:type="dxa" w:w="30"/>
-              <w:left w:type="dxa" w:w="70"/>
-              <w:bottom w:type="dxa" w:w="30"/>
-              <w:right w:type="dxa" w:w="70"/>
-            </w:tcMar>
-            <w:vAlign w:val="center"/>
-          </w:tcPr>
-          <w:p>
-            <w:pPr>
-              <w:keepNext w:val="false"/>
-              <w:spacing w:after="0" w:before="0" w:line="240" w:lineRule="auto"/>
-              <w:jc w:val="left"/>
-            </w:pPr>
-            <w:r>
-              <w:rPr>
-                <w:rFonts w:ascii="Times New Roman" w:cs="Times New Roman" w:eastAsia="Times New Roman" w:hAnsi="Times New Roman"/>
-                <w:b w:val="false"/>
-                <w:bCs w:val="false"/>
+              <w:t xml:space="preserve">Điểm danh học sinh bằng khuôn mặt — </w:t>
+            </w:r>
+            <w:r>
+              <w:rPr>
+                <w:rFonts w:ascii="Times New Roman" w:cs="Times New Roman" w:eastAsia="Times New Roman" w:hAnsi="Times New Roman"/>
+                <w:b/>
+                <w:bCs/>
                 <w:i w:val="false"/>
                 <w:iCs w:val="false"/>
                 <w:sz w:val="18"/>
                 <w:szCs w:val="18"/>
               </w:rPr>
-              <w:t xml:space="preserve">Template của trẻ em; nhật ký điểm danh</w:t>
-            </w:r>
-          </w:p>
-        </w:tc>
-        <w:tc>
-          <w:tcPr>
-            <w:tcW w:type="dxa" w:w="1305"/>
-            <w:tcBorders>
-              <w:top w:val="single" w:color="000000" w:sz="4"/>
-              <w:left w:val="single" w:color="000000" w:sz="4"/>
-              <w:bottom w:val="single" w:color="000000" w:sz="4"/>
-              <w:right w:val="single" w:color="000000" w:sz="4"/>
-            </w:tcBorders>
-            <w:tcMar>
-              <w:top w:type="dxa" w:w="30"/>
-              <w:left w:type="dxa" w:w="70"/>
-              <w:bottom w:type="dxa" w:w="30"/>
-              <w:right w:type="dxa" w:w="70"/>
-            </w:tcMar>
-            <w:vAlign w:val="center"/>
-          </w:tcPr>
-          <w:p>
-            <w:pPr>
-              <w:keepNext w:val="false"/>
-              <w:spacing w:after="0" w:before="0" w:line="240" w:lineRule="auto"/>
-              <w:jc w:val="left"/>
-            </w:pPr>
+              <w:t xml:space="preserve">xác nhận có mặt</w:t>
+            </w:r>
             <w:r>
               <w:rPr>
                 <w:rFonts w:ascii="Times New Roman" w:cs="Times New Roman" w:eastAsia="Times New Roman" w:hAnsi="Times New Roman"/>
@@ -8324,13 +8274,87 @@
                 <w:sz w:val="18"/>
                 <w:szCs w:val="18"/>
               </w:rPr>
-              <w:t xml:space="preserve">Có — ghi vắng mặt, thông báo phụ huynh</w:t>
-            </w:r>
-          </w:p>
-        </w:tc>
-        <w:tc>
-          <w:tcPr>
-            <w:tcW w:type="dxa" w:w="1634"/>
+              <w:t xml:space="preserve"> (check-in tại cổng, cửa lớp)</w:t>
+            </w:r>
+          </w:p>
+        </w:tc>
+        <w:tc>
+          <w:tcPr>
+            <w:tcW w:type="dxa" w:w="1535"/>
+            <w:tcBorders>
+              <w:top w:val="single" w:color="000000" w:sz="4"/>
+              <w:left w:val="single" w:color="000000" w:sz="4"/>
+              <w:bottom w:val="single" w:color="000000" w:sz="4"/>
+              <w:right w:val="single" w:color="000000" w:sz="4"/>
+            </w:tcBorders>
+            <w:tcMar>
+              <w:top w:type="dxa" w:w="30"/>
+              <w:left w:type="dxa" w:w="70"/>
+              <w:bottom w:type="dxa" w:w="30"/>
+              <w:right w:type="dxa" w:w="70"/>
+            </w:tcMar>
+            <w:vAlign w:val="center"/>
+          </w:tcPr>
+          <w:p>
+            <w:pPr>
+              <w:keepNext w:val="false"/>
+              <w:spacing w:after="0" w:before="0" w:line="240" w:lineRule="auto"/>
+              <w:jc w:val="left"/>
+            </w:pPr>
+            <w:r>
+              <w:rPr>
+                <w:rFonts w:ascii="Times New Roman" w:cs="Times New Roman" w:eastAsia="Times New Roman" w:hAnsi="Times New Roman"/>
+                <w:b w:val="false"/>
+                <w:bCs w:val="false"/>
+                <w:i w:val="false"/>
+                <w:iCs w:val="false"/>
+                <w:sz w:val="18"/>
+                <w:szCs w:val="18"/>
+              </w:rPr>
+              <w:t xml:space="preserve">Template của trẻ em; nhật ký điểm danh</w:t>
+            </w:r>
+          </w:p>
+        </w:tc>
+        <w:tc>
+          <w:tcPr>
+            <w:tcW w:type="dxa" w:w="1342"/>
+            <w:tcBorders>
+              <w:top w:val="single" w:color="000000" w:sz="4"/>
+              <w:left w:val="single" w:color="000000" w:sz="4"/>
+              <w:bottom w:val="single" w:color="000000" w:sz="4"/>
+              <w:right w:val="single" w:color="000000" w:sz="4"/>
+            </w:tcBorders>
+            <w:tcMar>
+              <w:top w:type="dxa" w:w="30"/>
+              <w:left w:type="dxa" w:w="70"/>
+              <w:bottom w:type="dxa" w:w="30"/>
+              <w:right w:type="dxa" w:w="70"/>
+            </w:tcMar>
+            <w:vAlign w:val="center"/>
+          </w:tcPr>
+          <w:p>
+            <w:pPr>
+              <w:keepNext w:val="false"/>
+              <w:spacing w:after="0" w:before="0" w:line="240" w:lineRule="auto"/>
+              <w:jc w:val="left"/>
+            </w:pPr>
+            <w:r>
+              <w:rPr>
+                <w:rFonts w:ascii="Times New Roman" w:cs="Times New Roman" w:eastAsia="Times New Roman" w:hAnsi="Times New Roman"/>
+                <w:b w:val="false"/>
+                <w:bCs w:val="false"/>
+                <w:i w:val="false"/>
+                <w:iCs w:val="false"/>
+                <w:sz w:val="18"/>
+                <w:szCs w:val="18"/>
+              </w:rPr>
+              <w:t xml:space="preserve">Có — ghi có mặt; vắng mặt do giáo viên xác nhận</w:t>
+            </w:r>
+          </w:p>
+        </w:tc>
+        <w:tc>
+          <w:tcPr>
+            <w:tcW w:type="dxa" w:w="1578"/>
             <w:tcBorders>
               <w:top w:val="single" w:color="000000" w:sz="4"/>
               <w:left w:val="single" w:color="000000" w:sz="4"/>
@@ -8367,7 +8391,7 @@
         </w:tc>
         <w:tc>
           <w:tcPr>
-            <w:tcW w:type="dxa" w:w="1634"/>
+            <w:tcW w:type="dxa" w:w="1578"/>
             <w:tcBorders>
               <w:top w:val="single" w:color="000000" w:sz="4"/>
               <w:left w:val="single" w:color="000000" w:sz="4"/>
@@ -8398,13 +8422,13 @@
                 <w:sz w:val="18"/>
                 <w:szCs w:val="18"/>
               </w:rPr>
-              <w:t xml:space="preserve">Trẻ em (Luật 91 Đ24); dịch vụ giáo dục có yếu tố giám sát (NĐ 356 Đ21.5)</w:t>
-            </w:r>
-          </w:p>
-        </w:tc>
-        <w:tc>
-          <w:tcPr>
-            <w:tcW w:type="dxa" w:w="1767"/>
+              <w:t xml:space="preserve">Trẻ em (Luật 91 Đ24); dữ liệu sinh trắc học nhạy cảm (NĐ 356 Đ4.1.đ); dịch vụ giáo dục có yếu tố giám sát (NĐ 356 Đ21.5)</w:t>
+            </w:r>
+          </w:p>
+        </w:tc>
+        <w:tc>
+          <w:tcPr>
+            <w:tcW w:type="dxa" w:w="1711"/>
             <w:tcBorders>
               <w:top w:val="single" w:color="000000" w:sz="4"/>
               <w:left w:val="single" w:color="000000" w:sz="4"/>
@@ -8435,13 +8459,13 @@
                 <w:sz w:val="18"/>
                 <w:szCs w:val="18"/>
               </w:rPr>
-              <w:t xml:space="preserve">Đồng ý của người đại diện theo pháp luật; phương án thay thế; không kết hợp nhận diện cảm xúc, chấm điểm hành vi; vắng mặt do không nhận diện được phải được giáo viên xác nhận</w:t>
-            </w:r>
-          </w:p>
-        </w:tc>
-        <w:tc>
-          <w:tcPr>
-            <w:tcW w:type="dxa" w:w="2040"/>
+              <w:t xml:space="preserve">Đồng ý của người đại diện theo pháp luật (và của trẻ từ đủ 07 tuổi); phương án thay thế; chỉ nhận diện tại thời điểm điểm danh, không theo dõi liên tục trong giờ học; không nhận diện cảm xúc, ánh mắt, mức độ chú ý; không cảnh báo tự động tần suất cao; kết quả chuyên cần không dùng làm căn cứ chính thức đánh giá, xếp hạng</w:t>
+            </w:r>
+          </w:p>
+        </w:tc>
+        <w:tc>
+          <w:tcPr>
+            <w:tcW w:type="dxa" w:w="2029"/>
             <w:tcBorders>
               <w:top w:val="single" w:color="000000" w:sz="4"/>
               <w:left w:val="single" w:color="000000" w:sz="4"/>
@@ -8472,7 +8496,7 @@
                 <w:sz w:val="18"/>
                 <w:szCs w:val="18"/>
               </w:rPr>
-              <w:t xml:space="preserve">Vùng xám. Khuyến nghị coi là Cao</w:t>
+              <w:t xml:space="preserve">Thấp</w:t>
             </w:r>
             <w:r>
               <w:rPr>
@@ -8484,7 +8508,7 @@
                 <w:sz w:val="18"/>
                 <w:szCs w:val="18"/>
               </w:rPr>
-              <w:t xml:space="preserve"> (I.3) — </w:t>
+              <w:t xml:space="preserve"> khi giữ đúng các giới hạn ở cột trước — </w:t>
             </w:r>
             <w:r>
               <w:rPr>
@@ -8502,7 +8526,7 @@
         </w:tc>
         <w:tc>
           <w:tcPr>
-            <w:tcW w:type="dxa" w:w="2065"/>
+            <w:tcW w:type="dxa" w:w="2010"/>
             <w:tcBorders>
               <w:top w:val="single" w:color="000000" w:sz="4"/>
               <w:left w:val="single" w:color="000000" w:sz="4"/>
@@ -8533,7 +8557,55 @@
                 <w:sz w:val="18"/>
                 <w:szCs w:val="18"/>
               </w:rPr>
-              <w:t xml:space="preserve">I.3 bao trùm hệ thống giám sát người học có sử dụng dữ liệu sinh trắc học (nhận diện khuôn mặt). Điểm danh 1:1 tại cổng có thể lập luận là không "phân tích hành vi"; điểm danh liên tục trong lớp, cảnh báo chuyên cần tự động cho phụ huynh sát với "cảnh báo tự động tần suất cao". Kết quả chuyên cần dùng làm căn cứ chính thức đánh giá, xếp hạng học sinh: thêm I.2. Có thể đề nghị Bộ KH&amp;CN hướng dẫn (Luật 134 Đ10.4)</w:t>
+              <w:t xml:space="preserve">Lập luận: I.3 áp dụng cho hệ thống "giám sát, phân tích hành vi người học"; xác nhận danh tính để ghi có mặt không phải giám sát, phân tích hành vi. Điều kiện của I.3 dùng chữ "</w:t>
+            </w:r>
+            <w:r>
+              <w:rPr>
+                <w:rFonts w:ascii="Times New Roman" w:cs="Times New Roman" w:eastAsia="Times New Roman" w:hAnsi="Times New Roman"/>
+                <w:b/>
+                <w:bCs/>
+                <w:i w:val="false"/>
+                <w:iCs w:val="false"/>
+                <w:sz w:val="18"/>
+                <w:szCs w:val="18"/>
+              </w:rPr>
+              <w:t xml:space="preserve">hoặc</w:t>
+            </w:r>
+            <w:r>
+              <w:rPr>
+                <w:rFonts w:ascii="Times New Roman" w:cs="Times New Roman" w:eastAsia="Times New Roman" w:hAnsi="Times New Roman"/>
+                <w:b w:val="false"/>
+                <w:bCs w:val="false"/>
+                <w:i w:val="false"/>
+                <w:iCs w:val="false"/>
+                <w:sz w:val="18"/>
+                <w:szCs w:val="18"/>
+              </w:rPr>
+              <w:t xml:space="preserve">" (dữ liệu sinh trắc học </w:t>
+            </w:r>
+            <w:r>
+              <w:rPr>
+                <w:rFonts w:ascii="Times New Roman" w:cs="Times New Roman" w:eastAsia="Times New Roman" w:hAnsi="Times New Roman"/>
+                <w:b/>
+                <w:bCs/>
+                <w:i w:val="false"/>
+                <w:iCs w:val="false"/>
+                <w:sz w:val="18"/>
+                <w:szCs w:val="18"/>
+              </w:rPr>
+              <w:t xml:space="preserve">hoặc</w:t>
+            </w:r>
+            <w:r>
+              <w:rPr>
+                <w:rFonts w:ascii="Times New Roman" w:cs="Times New Roman" w:eastAsia="Times New Roman" w:hAnsi="Times New Roman"/>
+                <w:b w:val="false"/>
+                <w:bCs w:val="false"/>
+                <w:i w:val="false"/>
+                <w:iCs w:val="false"/>
+                <w:sz w:val="18"/>
+                <w:szCs w:val="18"/>
+              </w:rPr>
+              <w:t xml:space="preserve"> cảnh báo tự động tần suất cao), nên không thể lập luận rằng phải hội tụ đủ các yếu tố. Ghi lập luận vào hồ sơ phân loại; nếu chưa chắc, đề nghị Bộ KH&amp;CN hướng dẫn (Luật 134 Đ10.4)</w:t>
             </w:r>
           </w:p>
         </w:tc>
@@ -8576,13 +8648,13 @@
                 <w:sz w:val="18"/>
                 <w:szCs w:val="18"/>
               </w:rPr>
-              <w:t xml:space="preserve">F9</w:t>
-            </w:r>
-          </w:p>
-        </w:tc>
-        <w:tc>
-          <w:tcPr>
-            <w:tcW w:type="dxa" w:w="1428"/>
+              <w:t xml:space="preserve">F8b</w:t>
+            </w:r>
+          </w:p>
+        </w:tc>
+        <w:tc>
+          <w:tcPr>
+            <w:tcW w:type="dxa" w:w="1677"/>
             <w:tcBorders>
               <w:top w:val="single" w:color="000000" w:sz="4"/>
               <w:left w:val="single" w:color="000000" w:sz="4"/>
@@ -8613,70 +8685,20 @@
                 <w:sz w:val="18"/>
                 <w:szCs w:val="18"/>
               </w:rPr>
-              <w:t xml:space="preserve">Dựng hành trình một người, một xe qua nhiều camera</w:t>
-            </w:r>
-          </w:p>
-        </w:tc>
-        <w:tc>
-          <w:tcPr>
-            <w:tcW w:type="dxa" w:w="1587"/>
-            <w:tcBorders>
-              <w:top w:val="single" w:color="000000" w:sz="4"/>
-              <w:left w:val="single" w:color="000000" w:sz="4"/>
-              <w:bottom w:val="single" w:color="000000" w:sz="4"/>
-              <w:right w:val="single" w:color="000000" w:sz="4"/>
-            </w:tcBorders>
-            <w:tcMar>
-              <w:top w:type="dxa" w:w="30"/>
-              <w:left w:type="dxa" w:w="70"/>
-              <w:bottom w:type="dxa" w:w="30"/>
-              <w:right w:type="dxa" w:w="70"/>
-            </w:tcMar>
-            <w:vAlign w:val="center"/>
-          </w:tcPr>
-          <w:p>
-            <w:pPr>
-              <w:keepNext w:val="false"/>
-              <w:spacing w:after="0" w:before="0" w:line="240" w:lineRule="auto"/>
-              <w:jc w:val="left"/>
-            </w:pPr>
-            <w:r>
-              <w:rPr>
-                <w:rFonts w:ascii="Times New Roman" w:cs="Times New Roman" w:eastAsia="Times New Roman" w:hAnsi="Times New Roman"/>
-                <w:b w:val="false"/>
-                <w:bCs w:val="false"/>
+              <w:t xml:space="preserve">Camera lớp học nhận diện học sinh </w:t>
+            </w:r>
+            <w:r>
+              <w:rPr>
+                <w:rFonts w:ascii="Times New Roman" w:cs="Times New Roman" w:eastAsia="Times New Roman" w:hAnsi="Times New Roman"/>
+                <w:b/>
+                <w:bCs/>
                 <w:i w:val="false"/>
                 <w:iCs w:val="false"/>
                 <w:sz w:val="18"/>
                 <w:szCs w:val="18"/>
               </w:rPr>
-              <w:t xml:space="preserve">Template hoặc đặc điểm nhận dạng lại; thời gian, vị trí camera</w:t>
-            </w:r>
-          </w:p>
-        </w:tc>
-        <w:tc>
-          <w:tcPr>
-            <w:tcW w:type="dxa" w:w="1305"/>
-            <w:tcBorders>
-              <w:top w:val="single" w:color="000000" w:sz="4"/>
-              <w:left w:val="single" w:color="000000" w:sz="4"/>
-              <w:bottom w:val="single" w:color="000000" w:sz="4"/>
-              <w:right w:val="single" w:color="000000" w:sz="4"/>
-            </w:tcBorders>
-            <w:tcMar>
-              <w:top w:type="dxa" w:w="30"/>
-              <w:left w:type="dxa" w:w="70"/>
-              <w:bottom w:type="dxa" w:w="30"/>
-              <w:right w:type="dxa" w:w="70"/>
-            </w:tcMar>
-            <w:vAlign w:val="center"/>
-          </w:tcPr>
-          <w:p>
-            <w:pPr>
-              <w:keepNext w:val="false"/>
-              <w:spacing w:after="0" w:before="0" w:line="240" w:lineRule="auto"/>
-              <w:jc w:val="left"/>
-            </w:pPr>
+              <w:t xml:space="preserve">liên tục</w:t>
+            </w:r>
             <w:r>
               <w:rPr>
                 <w:rFonts w:ascii="Times New Roman" w:cs="Times New Roman" w:eastAsia="Times New Roman" w:hAnsi="Times New Roman"/>
@@ -8687,13 +8709,87 @@
                 <w:sz w:val="18"/>
                 <w:szCs w:val="18"/>
               </w:rPr>
-              <w:t xml:space="preserve">Không trực tiếp</w:t>
-            </w:r>
-          </w:p>
-        </w:tc>
-        <w:tc>
-          <w:tcPr>
-            <w:tcW w:type="dxa" w:w="1634"/>
+              <w:t xml:space="preserve"> hoặc nhiều lần trong giờ học; cảnh báo chuyên cần, nề nếp tự động cho giáo viên, phụ huynh</w:t>
+            </w:r>
+          </w:p>
+        </w:tc>
+        <w:tc>
+          <w:tcPr>
+            <w:tcW w:type="dxa" w:w="1535"/>
+            <w:tcBorders>
+              <w:top w:val="single" w:color="000000" w:sz="4"/>
+              <w:left w:val="single" w:color="000000" w:sz="4"/>
+              <w:bottom w:val="single" w:color="000000" w:sz="4"/>
+              <w:right w:val="single" w:color="000000" w:sz="4"/>
+            </w:tcBorders>
+            <w:tcMar>
+              <w:top w:type="dxa" w:w="30"/>
+              <w:left w:type="dxa" w:w="70"/>
+              <w:bottom w:type="dxa" w:w="30"/>
+              <w:right w:type="dxa" w:w="70"/>
+            </w:tcMar>
+            <w:vAlign w:val="center"/>
+          </w:tcPr>
+          <w:p>
+            <w:pPr>
+              <w:keepNext w:val="false"/>
+              <w:spacing w:after="0" w:before="0" w:line="240" w:lineRule="auto"/>
+              <w:jc w:val="left"/>
+            </w:pPr>
+            <w:r>
+              <w:rPr>
+                <w:rFonts w:ascii="Times New Roman" w:cs="Times New Roman" w:eastAsia="Times New Roman" w:hAnsi="Times New Roman"/>
+                <w:b w:val="false"/>
+                <w:bCs w:val="false"/>
+                <w:i w:val="false"/>
+                <w:iCs w:val="false"/>
+                <w:sz w:val="18"/>
+                <w:szCs w:val="18"/>
+              </w:rPr>
+              <w:t xml:space="preserve">Template của trẻ em; hình ảnh, nhật ký theo dõi trong lớp</w:t>
+            </w:r>
+          </w:p>
+        </w:tc>
+        <w:tc>
+          <w:tcPr>
+            <w:tcW w:type="dxa" w:w="1342"/>
+            <w:tcBorders>
+              <w:top w:val="single" w:color="000000" w:sz="4"/>
+              <w:left w:val="single" w:color="000000" w:sz="4"/>
+              <w:bottom w:val="single" w:color="000000" w:sz="4"/>
+              <w:right w:val="single" w:color="000000" w:sz="4"/>
+            </w:tcBorders>
+            <w:tcMar>
+              <w:top w:type="dxa" w:w="30"/>
+              <w:left w:type="dxa" w:w="70"/>
+              <w:bottom w:type="dxa" w:w="30"/>
+              <w:right w:type="dxa" w:w="70"/>
+            </w:tcMar>
+            <w:vAlign w:val="center"/>
+          </w:tcPr>
+          <w:p>
+            <w:pPr>
+              <w:keepNext w:val="false"/>
+              <w:spacing w:after="0" w:before="0" w:line="240" w:lineRule="auto"/>
+              <w:jc w:val="left"/>
+            </w:pPr>
+            <w:r>
+              <w:rPr>
+                <w:rFonts w:ascii="Times New Roman" w:cs="Times New Roman" w:eastAsia="Times New Roman" w:hAnsi="Times New Roman"/>
+                <w:b w:val="false"/>
+                <w:bCs w:val="false"/>
+                <w:i w:val="false"/>
+                <w:iCs w:val="false"/>
+                <w:sz w:val="18"/>
+                <w:szCs w:val="18"/>
+              </w:rPr>
+              <w:t xml:space="preserve">Có — cảnh báo tự động</w:t>
+            </w:r>
+          </w:p>
+        </w:tc>
+        <w:tc>
+          <w:tcPr>
+            <w:tcW w:type="dxa" w:w="1578"/>
             <w:tcBorders>
               <w:top w:val="single" w:color="000000" w:sz="4"/>
               <w:left w:val="single" w:color="000000" w:sz="4"/>
@@ -8760,13 +8856,13 @@
                 <w:sz w:val="18"/>
                 <w:szCs w:val="18"/>
               </w:rPr>
-              <w:t xml:space="preserve"> khi theo dõi hàng loạt không có căn cứ</w:t>
-            </w:r>
-          </w:p>
-        </w:tc>
-        <w:tc>
-          <w:tcPr>
-            <w:tcW w:type="dxa" w:w="1634"/>
+              <w:t xml:space="preserve"> nếu kết hợp F7 gắn với từng học sinh</w:t>
+            </w:r>
+          </w:p>
+        </w:tc>
+        <w:tc>
+          <w:tcPr>
+            <w:tcW w:type="dxa" w:w="1578"/>
             <w:tcBorders>
               <w:top w:val="single" w:color="000000" w:sz="4"/>
               <w:left w:val="single" w:color="000000" w:sz="4"/>
@@ -8797,13 +8893,13 @@
                 <w:sz w:val="18"/>
                 <w:szCs w:val="18"/>
               </w:rPr>
-              <w:t xml:space="preserve">Có thể là dữ liệu vị trí nhạy cảm (NĐ 356 Đ4.1.h — V4) và thông tin đời sống riêng tư (Đ4.1.c)</w:t>
-            </w:r>
-          </w:p>
-        </w:tc>
-        <w:tc>
-          <w:tcPr>
-            <w:tcW w:type="dxa" w:w="1767"/>
+              <w:t xml:space="preserve">Như F8a; thêm theo dõi hành vi trẻ em trong thời gian dài</w:t>
+            </w:r>
+          </w:p>
+        </w:tc>
+        <w:tc>
+          <w:tcPr>
+            <w:tcW w:type="dxa" w:w="1711"/>
             <w:tcBorders>
               <w:top w:val="single" w:color="000000" w:sz="4"/>
               <w:left w:val="single" w:color="000000" w:sz="4"/>
@@ -8834,13 +8930,13 @@
                 <w:sz w:val="18"/>
                 <w:szCs w:val="18"/>
               </w:rPr>
-              <w:t xml:space="preserve">Tắt mặc định; chỉ dùng tra cứu theo vụ việc, có phê duyệt của người được khách hàng ủy quyền, ghi nhật ký từng lần tra cứu; không chạy liên tục</w:t>
-            </w:r>
-          </w:p>
-        </w:tc>
-        <w:tc>
-          <w:tcPr>
-            <w:tcW w:type="dxa" w:w="2040"/>
+              <w:t xml:space="preserve">Tắt mặc định; chỉ bật sau khi đã phân loại lại, có hồ sơ đánh giá tác động riêng</w:t>
+            </w:r>
+          </w:p>
+        </w:tc>
+        <w:tc>
+          <w:tcPr>
+            <w:tcW w:type="dxa" w:w="2029"/>
             <w:tcBorders>
               <w:top w:val="single" w:color="000000" w:sz="4"/>
               <w:left w:val="single" w:color="000000" w:sz="4"/>
@@ -8871,13 +8967,400 @@
                 <w:sz w:val="18"/>
                 <w:szCs w:val="18"/>
               </w:rPr>
+              <w:t xml:space="preserve">Cao</w:t>
+            </w:r>
+            <w:r>
+              <w:rPr>
+                <w:rFonts w:ascii="Times New Roman" w:cs="Times New Roman" w:eastAsia="Times New Roman" w:hAnsi="Times New Roman"/>
+                <w:b w:val="false"/>
+                <w:bCs w:val="false"/>
+                <w:i w:val="false"/>
+                <w:iCs w:val="false"/>
+                <w:sz w:val="18"/>
+                <w:szCs w:val="18"/>
+              </w:rPr>
+              <w:t xml:space="preserve"> (I.3)</w:t>
+            </w:r>
+          </w:p>
+        </w:tc>
+        <w:tc>
+          <w:tcPr>
+            <w:tcW w:type="dxa" w:w="2010"/>
+            <w:tcBorders>
+              <w:top w:val="single" w:color="000000" w:sz="4"/>
+              <w:left w:val="single" w:color="000000" w:sz="4"/>
+              <w:bottom w:val="single" w:color="000000" w:sz="4"/>
+              <w:right w:val="single" w:color="000000" w:sz="4"/>
+            </w:tcBorders>
+            <w:tcMar>
+              <w:top w:type="dxa" w:w="30"/>
+              <w:left w:type="dxa" w:w="70"/>
+              <w:bottom w:type="dxa" w:w="30"/>
+              <w:right w:type="dxa" w:w="70"/>
+            </w:tcMar>
+            <w:vAlign w:val="center"/>
+          </w:tcPr>
+          <w:p>
+            <w:pPr>
+              <w:keepNext w:val="false"/>
+              <w:spacing w:after="0" w:before="0" w:line="240" w:lineRule="auto"/>
+              <w:jc w:val="left"/>
+            </w:pPr>
+            <w:r>
+              <w:rPr>
+                <w:rFonts w:ascii="Times New Roman" w:cs="Times New Roman" w:eastAsia="Times New Roman" w:hAnsi="Times New Roman"/>
+                <w:b w:val="false"/>
+                <w:bCs w:val="false"/>
+                <w:i w:val="false"/>
+                <w:iCs w:val="false"/>
+                <w:sz w:val="18"/>
+                <w:szCs w:val="18"/>
+              </w:rPr>
+              <w:t xml:space="preserve">Sát với "giám sát, phân tích hành vi người học" có sử dụng dữ liệu sinh trắc học hoặc cảnh báo tự động tần suất cao. Kết quả dùng làm căn cứ chính thức đánh giá, xếp hạng học sinh: thêm I.2</w:t>
+            </w:r>
+          </w:p>
+        </w:tc>
+      </w:tr>
+      <w:tr>
+        <w:trPr>
+          <w:cantSplit/>
+          <w:tblHeader w:val="false"/>
+        </w:trPr>
+        <w:tc>
+          <w:tcPr>
+            <w:tcW w:type="dxa" w:w="497"/>
+            <w:tcBorders>
+              <w:top w:val="single" w:color="000000" w:sz="4"/>
+              <w:left w:val="single" w:color="000000" w:sz="4"/>
+              <w:bottom w:val="single" w:color="000000" w:sz="4"/>
+              <w:right w:val="single" w:color="000000" w:sz="4"/>
+            </w:tcBorders>
+            <w:tcMar>
+              <w:top w:type="dxa" w:w="30"/>
+              <w:left w:type="dxa" w:w="70"/>
+              <w:bottom w:type="dxa" w:w="30"/>
+              <w:right w:type="dxa" w:w="70"/>
+            </w:tcMar>
+            <w:vAlign w:val="center"/>
+          </w:tcPr>
+          <w:p>
+            <w:pPr>
+              <w:keepNext w:val="false"/>
+              <w:spacing w:after="0" w:before="0" w:line="240" w:lineRule="auto"/>
+              <w:jc w:val="left"/>
+            </w:pPr>
+            <w:r>
+              <w:rPr>
+                <w:rFonts w:ascii="Times New Roman" w:cs="Times New Roman" w:eastAsia="Times New Roman" w:hAnsi="Times New Roman"/>
+                <w:b w:val="false"/>
+                <w:bCs w:val="false"/>
+                <w:i w:val="false"/>
+                <w:iCs w:val="false"/>
+                <w:sz w:val="18"/>
+                <w:szCs w:val="18"/>
+              </w:rPr>
+              <w:t xml:space="preserve">F9</w:t>
+            </w:r>
+          </w:p>
+        </w:tc>
+        <w:tc>
+          <w:tcPr>
+            <w:tcW w:type="dxa" w:w="1677"/>
+            <w:tcBorders>
+              <w:top w:val="single" w:color="000000" w:sz="4"/>
+              <w:left w:val="single" w:color="000000" w:sz="4"/>
+              <w:bottom w:val="single" w:color="000000" w:sz="4"/>
+              <w:right w:val="single" w:color="000000" w:sz="4"/>
+            </w:tcBorders>
+            <w:tcMar>
+              <w:top w:type="dxa" w:w="30"/>
+              <w:left w:type="dxa" w:w="70"/>
+              <w:bottom w:type="dxa" w:w="30"/>
+              <w:right w:type="dxa" w:w="70"/>
+            </w:tcMar>
+            <w:vAlign w:val="center"/>
+          </w:tcPr>
+          <w:p>
+            <w:pPr>
+              <w:keepNext w:val="false"/>
+              <w:spacing w:after="0" w:before="0" w:line="240" w:lineRule="auto"/>
+              <w:jc w:val="left"/>
+            </w:pPr>
+            <w:r>
+              <w:rPr>
+                <w:rFonts w:ascii="Times New Roman" w:cs="Times New Roman" w:eastAsia="Times New Roman" w:hAnsi="Times New Roman"/>
+                <w:b w:val="false"/>
+                <w:bCs w:val="false"/>
+                <w:i w:val="false"/>
+                <w:iCs w:val="false"/>
+                <w:sz w:val="18"/>
+                <w:szCs w:val="18"/>
+              </w:rPr>
+              <w:t xml:space="preserve">Dựng hành trình một người, một xe qua nhiều camera</w:t>
+            </w:r>
+          </w:p>
+        </w:tc>
+        <w:tc>
+          <w:tcPr>
+            <w:tcW w:type="dxa" w:w="1535"/>
+            <w:tcBorders>
+              <w:top w:val="single" w:color="000000" w:sz="4"/>
+              <w:left w:val="single" w:color="000000" w:sz="4"/>
+              <w:bottom w:val="single" w:color="000000" w:sz="4"/>
+              <w:right w:val="single" w:color="000000" w:sz="4"/>
+            </w:tcBorders>
+            <w:tcMar>
+              <w:top w:type="dxa" w:w="30"/>
+              <w:left w:type="dxa" w:w="70"/>
+              <w:bottom w:type="dxa" w:w="30"/>
+              <w:right w:type="dxa" w:w="70"/>
+            </w:tcMar>
+            <w:vAlign w:val="center"/>
+          </w:tcPr>
+          <w:p>
+            <w:pPr>
+              <w:keepNext w:val="false"/>
+              <w:spacing w:after="0" w:before="0" w:line="240" w:lineRule="auto"/>
+              <w:jc w:val="left"/>
+            </w:pPr>
+            <w:r>
+              <w:rPr>
+                <w:rFonts w:ascii="Times New Roman" w:cs="Times New Roman" w:eastAsia="Times New Roman" w:hAnsi="Times New Roman"/>
+                <w:b w:val="false"/>
+                <w:bCs w:val="false"/>
+                <w:i w:val="false"/>
+                <w:iCs w:val="false"/>
+                <w:sz w:val="18"/>
+                <w:szCs w:val="18"/>
+              </w:rPr>
+              <w:t xml:space="preserve">Template hoặc đặc điểm nhận dạng lại; thời gian, vị trí camera</w:t>
+            </w:r>
+          </w:p>
+        </w:tc>
+        <w:tc>
+          <w:tcPr>
+            <w:tcW w:type="dxa" w:w="1342"/>
+            <w:tcBorders>
+              <w:top w:val="single" w:color="000000" w:sz="4"/>
+              <w:left w:val="single" w:color="000000" w:sz="4"/>
+              <w:bottom w:val="single" w:color="000000" w:sz="4"/>
+              <w:right w:val="single" w:color="000000" w:sz="4"/>
+            </w:tcBorders>
+            <w:tcMar>
+              <w:top w:type="dxa" w:w="30"/>
+              <w:left w:type="dxa" w:w="70"/>
+              <w:bottom w:type="dxa" w:w="30"/>
+              <w:right w:type="dxa" w:w="70"/>
+            </w:tcMar>
+            <w:vAlign w:val="center"/>
+          </w:tcPr>
+          <w:p>
+            <w:pPr>
+              <w:keepNext w:val="false"/>
+              <w:spacing w:after="0" w:before="0" w:line="240" w:lineRule="auto"/>
+              <w:jc w:val="left"/>
+            </w:pPr>
+            <w:r>
+              <w:rPr>
+                <w:rFonts w:ascii="Times New Roman" w:cs="Times New Roman" w:eastAsia="Times New Roman" w:hAnsi="Times New Roman"/>
+                <w:b w:val="false"/>
+                <w:bCs w:val="false"/>
+                <w:i w:val="false"/>
+                <w:iCs w:val="false"/>
+                <w:sz w:val="18"/>
+                <w:szCs w:val="18"/>
+              </w:rPr>
+              <w:t xml:space="preserve">Không trực tiếp</w:t>
+            </w:r>
+          </w:p>
+        </w:tc>
+        <w:tc>
+          <w:tcPr>
+            <w:tcW w:type="dxa" w:w="1578"/>
+            <w:tcBorders>
+              <w:top w:val="single" w:color="000000" w:sz="4"/>
+              <w:left w:val="single" w:color="000000" w:sz="4"/>
+              <w:bottom w:val="single" w:color="000000" w:sz="4"/>
+              <w:right w:val="single" w:color="000000" w:sz="4"/>
+            </w:tcBorders>
+            <w:tcMar>
+              <w:top w:type="dxa" w:w="30"/>
+              <w:left w:type="dxa" w:w="70"/>
+              <w:bottom w:type="dxa" w:w="30"/>
+              <w:right w:type="dxa" w:w="70"/>
+            </w:tcMar>
+            <w:vAlign w:val="center"/>
+          </w:tcPr>
+          <w:p>
+            <w:pPr>
+              <w:keepNext w:val="false"/>
+              <w:spacing w:after="0" w:before="0" w:line="240" w:lineRule="auto"/>
+              <w:jc w:val="left"/>
+            </w:pPr>
+            <w:r>
+              <w:rPr>
+                <w:rFonts w:ascii="Times New Roman" w:cs="Times New Roman" w:eastAsia="Times New Roman" w:hAnsi="Times New Roman"/>
+                <w:b/>
+                <w:bCs/>
+                <w:i w:val="false"/>
+                <w:iCs w:val="false"/>
+                <w:sz w:val="18"/>
+                <w:szCs w:val="18"/>
+              </w:rPr>
+              <w:t xml:space="preserve">BV-Cao</w:t>
+            </w:r>
+            <w:r>
+              <w:rPr>
+                <w:rFonts w:ascii="Times New Roman" w:cs="Times New Roman" w:eastAsia="Times New Roman" w:hAnsi="Times New Roman"/>
+                <w:b w:val="false"/>
+                <w:bCs w:val="false"/>
+                <w:i w:val="false"/>
+                <w:iCs w:val="false"/>
+                <w:sz w:val="18"/>
+                <w:szCs w:val="18"/>
+              </w:rPr>
+              <w:t xml:space="preserve">; </w:t>
+            </w:r>
+            <w:r>
+              <w:rPr>
+                <w:rFonts w:ascii="Times New Roman" w:cs="Times New Roman" w:eastAsia="Times New Roman" w:hAnsi="Times New Roman"/>
+                <w:b/>
+                <w:bCs/>
+                <w:i w:val="false"/>
+                <w:iCs w:val="false"/>
+                <w:sz w:val="18"/>
+                <w:szCs w:val="18"/>
+              </w:rPr>
+              <w:t xml:space="preserve">BV-Không chấp nhận</w:t>
+            </w:r>
+            <w:r>
+              <w:rPr>
+                <w:rFonts w:ascii="Times New Roman" w:cs="Times New Roman" w:eastAsia="Times New Roman" w:hAnsi="Times New Roman"/>
+                <w:b w:val="false"/>
+                <w:bCs w:val="false"/>
+                <w:i w:val="false"/>
+                <w:iCs w:val="false"/>
+                <w:sz w:val="18"/>
+                <w:szCs w:val="18"/>
+              </w:rPr>
+              <w:t xml:space="preserve"> khi theo dõi hàng loạt không có căn cứ</w:t>
+            </w:r>
+          </w:p>
+        </w:tc>
+        <w:tc>
+          <w:tcPr>
+            <w:tcW w:type="dxa" w:w="1578"/>
+            <w:tcBorders>
+              <w:top w:val="single" w:color="000000" w:sz="4"/>
+              <w:left w:val="single" w:color="000000" w:sz="4"/>
+              <w:bottom w:val="single" w:color="000000" w:sz="4"/>
+              <w:right w:val="single" w:color="000000" w:sz="4"/>
+            </w:tcBorders>
+            <w:tcMar>
+              <w:top w:type="dxa" w:w="30"/>
+              <w:left w:type="dxa" w:w="70"/>
+              <w:bottom w:type="dxa" w:w="30"/>
+              <w:right w:type="dxa" w:w="70"/>
+            </w:tcMar>
+            <w:vAlign w:val="center"/>
+          </w:tcPr>
+          <w:p>
+            <w:pPr>
+              <w:keepNext w:val="false"/>
+              <w:spacing w:after="0" w:before="0" w:line="240" w:lineRule="auto"/>
+              <w:jc w:val="left"/>
+            </w:pPr>
+            <w:r>
+              <w:rPr>
+                <w:rFonts w:ascii="Times New Roman" w:cs="Times New Roman" w:eastAsia="Times New Roman" w:hAnsi="Times New Roman"/>
+                <w:b w:val="false"/>
+                <w:bCs w:val="false"/>
+                <w:i w:val="false"/>
+                <w:iCs w:val="false"/>
+                <w:sz w:val="18"/>
+                <w:szCs w:val="18"/>
+              </w:rPr>
+              <w:t xml:space="preserve">Có thể là dữ liệu vị trí nhạy cảm (NĐ 356 Đ4.1.h — V4) và thông tin đời sống riêng tư (Đ4.1.c)</w:t>
+            </w:r>
+          </w:p>
+        </w:tc>
+        <w:tc>
+          <w:tcPr>
+            <w:tcW w:type="dxa" w:w="1711"/>
+            <w:tcBorders>
+              <w:top w:val="single" w:color="000000" w:sz="4"/>
+              <w:left w:val="single" w:color="000000" w:sz="4"/>
+              <w:bottom w:val="single" w:color="000000" w:sz="4"/>
+              <w:right w:val="single" w:color="000000" w:sz="4"/>
+            </w:tcBorders>
+            <w:tcMar>
+              <w:top w:type="dxa" w:w="30"/>
+              <w:left w:type="dxa" w:w="70"/>
+              <w:bottom w:type="dxa" w:w="30"/>
+              <w:right w:type="dxa" w:w="70"/>
+            </w:tcMar>
+            <w:vAlign w:val="center"/>
+          </w:tcPr>
+          <w:p>
+            <w:pPr>
+              <w:keepNext w:val="false"/>
+              <w:spacing w:after="0" w:before="0" w:line="240" w:lineRule="auto"/>
+              <w:jc w:val="left"/>
+            </w:pPr>
+            <w:r>
+              <w:rPr>
+                <w:rFonts w:ascii="Times New Roman" w:cs="Times New Roman" w:eastAsia="Times New Roman" w:hAnsi="Times New Roman"/>
+                <w:b w:val="false"/>
+                <w:bCs w:val="false"/>
+                <w:i w:val="false"/>
+                <w:iCs w:val="false"/>
+                <w:sz w:val="18"/>
+                <w:szCs w:val="18"/>
+              </w:rPr>
+              <w:t xml:space="preserve">Tắt mặc định; chỉ dùng tra cứu theo vụ việc, có phê duyệt của người được khách hàng ủy quyền, ghi nhật ký từng lần tra cứu; không chạy liên tục</w:t>
+            </w:r>
+          </w:p>
+        </w:tc>
+        <w:tc>
+          <w:tcPr>
+            <w:tcW w:type="dxa" w:w="2029"/>
+            <w:tcBorders>
+              <w:top w:val="single" w:color="000000" w:sz="4"/>
+              <w:left w:val="single" w:color="000000" w:sz="4"/>
+              <w:bottom w:val="single" w:color="000000" w:sz="4"/>
+              <w:right w:val="single" w:color="000000" w:sz="4"/>
+            </w:tcBorders>
+            <w:tcMar>
+              <w:top w:type="dxa" w:w="30"/>
+              <w:left w:type="dxa" w:w="70"/>
+              <w:bottom w:type="dxa" w:w="30"/>
+              <w:right w:type="dxa" w:w="70"/>
+            </w:tcMar>
+            <w:vAlign w:val="center"/>
+          </w:tcPr>
+          <w:p>
+            <w:pPr>
+              <w:keepNext w:val="false"/>
+              <w:spacing w:after="0" w:before="0" w:line="240" w:lineRule="auto"/>
+              <w:jc w:val="left"/>
+            </w:pPr>
+            <w:r>
+              <w:rPr>
+                <w:rFonts w:ascii="Times New Roman" w:cs="Times New Roman" w:eastAsia="Times New Roman" w:hAnsi="Times New Roman"/>
+                <w:b/>
+                <w:bCs/>
+                <w:i w:val="false"/>
+                <w:iCs w:val="false"/>
+                <w:sz w:val="18"/>
+                <w:szCs w:val="18"/>
+              </w:rPr>
               <w:t xml:space="preserve">Thấp</w:t>
             </w:r>
           </w:p>
         </w:tc>
         <w:tc>
           <w:tcPr>
-            <w:tcW w:type="dxa" w:w="2065"/>
+            <w:tcW w:type="dxa" w:w="2010"/>
             <w:tcBorders>
               <w:top w:val="single" w:color="000000" w:sz="4"/>
               <w:left w:val="single" w:color="000000" w:sz="4"/>

</xml_diff>